<commit_message>
Minor updates still needed.
</commit_message>
<xml_diff>
--- a/Output/Grace_Table_4_Correlation_Matrix.docx
+++ b/Output/Grace_Table_4_Correlation_Matrix.docx
@@ -17,22 +17,22 @@
         <w:tblLook w:firstRow="1" w:lastRow="0" w:firstColumn="0" w:lastColumn="0" w:noHBand="0" w:noVBand="1"/>
       </w:tblPr>
       <w:tblGrid>
-        <w:gridCol w:w="3112"/>
+        <w:gridCol w:w="3579"/>
         <w:gridCol w:w="1056"/>
         <w:gridCol w:w="1056"/>
         <w:gridCol w:w="1067"/>
-        <w:gridCol w:w="1056"/>
         <w:gridCol w:w="1067"/>
         <w:gridCol w:w="378"/>
       </w:tblGrid>
       <w:tr>
         <w:trPr>
-          <w:trHeight w:val="470" w:hRule="auto"/>
+          <w:trHeight w:val="413" w:hRule="auto"/>
           <w:tblHeader/>
         </w:trPr>
-        <w:tc>
-          <w:tcPr>
-            <w:gridSpan w:val="7"/>
+        header1
+        <w:tc>
+          <w:tcPr>
+            <w:gridSpan w:val="6"/>
             <w:tcBorders>
               <w:bottom w:val="single" w:sz="12" w:space="0" w:color="666666"/>
               <w:top w:val="single" w:sz="12" w:space="0" w:color="666666"/>
@@ -50,7 +50,6 @@
           </w:tcPr>
           <w:p>
             <w:pPr>
-              <w:pStyle w:val="Normal"/>
               <w:jc w:val="left"/>
               <w:pBdr>
                 <w:bottom w:val="none" w:sz="0" w:space="0" w:color="000000"/>
@@ -82,16 +81,17 @@
                 <w:szCs w:val="20"/>
                 <w:color w:val="000000"/>
               </w:rPr>
-              <w:t xml:space="preserve">Table 3. Zero-order correlations among epigenetic aging measures, perceived cancer risk, age, self-efficacy, and chronic conditions.</w:t>
+              <w:t xml:space="preserve">1.1. Table 3. Zero-order correlations among epigenetic aging measures, perceived cancer risk, age, self-efficacy, and chronic conditions.</w:t>
             </w:r>
           </w:p>
         </w:tc>
       </w:tr>
       <w:tr>
         <w:trPr>
-          <w:trHeight w:val="470" w:hRule="auto"/>
+          <w:trHeight w:val="413" w:hRule="auto"/>
           <w:tblHeader/>
         </w:trPr>
+        header2
         <w:tc>
           <w:tcPr>
             <w:tcBorders>
@@ -111,7 +111,6 @@
           </w:tcPr>
           <w:p>
             <w:pPr>
-              <w:pStyle w:val="Normal"/>
               <w:jc w:val="left"/>
               <w:pBdr>
                 <w:bottom w:val="none" w:sz="0" w:space="0" w:color="000000"/>
@@ -166,7 +165,6 @@
           </w:tcPr>
           <w:p>
             <w:pPr>
-              <w:pStyle w:val="Normal"/>
               <w:jc w:val="center"/>
               <w:pBdr>
                 <w:bottom w:val="none" w:sz="0" w:space="0" w:color="000000"/>
@@ -221,7 +219,6 @@
           </w:tcPr>
           <w:p>
             <w:pPr>
-              <w:pStyle w:val="Normal"/>
               <w:jc w:val="center"/>
               <w:pBdr>
                 <w:bottom w:val="none" w:sz="0" w:space="0" w:color="000000"/>
@@ -276,7 +273,6 @@
           </w:tcPr>
           <w:p>
             <w:pPr>
-              <w:pStyle w:val="Normal"/>
               <w:jc w:val="center"/>
               <w:pBdr>
                 <w:bottom w:val="none" w:sz="0" w:space="0" w:color="000000"/>
@@ -331,7 +327,6 @@
           </w:tcPr>
           <w:p>
             <w:pPr>
-              <w:pStyle w:val="Normal"/>
               <w:jc w:val="center"/>
               <w:pBdr>
                 <w:bottom w:val="none" w:sz="0" w:space="0" w:color="000000"/>
@@ -386,7 +381,6 @@
           </w:tcPr>
           <w:p>
             <w:pPr>
-              <w:pStyle w:val="Normal"/>
               <w:jc w:val="center"/>
               <w:pBdr>
                 <w:bottom w:val="none" w:sz="0" w:space="0" w:color="000000"/>
@@ -419,69 +413,15 @@
                 <w:color w:val="000000"/>
               </w:rPr>
               <w:t xml:space="preserve">5</w:t>
-            </w:r>
-          </w:p>
-        </w:tc>
-        <w:tc>
-          <w:tcPr>
-            <w:tcBorders>
-              <w:bottom w:val="single" w:sz="12" w:space="0" w:color="666666"/>
-              <w:top w:val="single" w:sz="12" w:space="0" w:color="666666"/>
-              <w:left w:val="none" w:sz="0" w:space="0" w:color="000000"/>
-              <w:right w:val="none" w:sz="0" w:space="0" w:color="000000"/>
-            </w:tcBorders>
-            <w:shd w:val="clear" w:color="auto" w:fill="FFFFFF"/>
-            <w:tcMar>
-              <w:top w:w="0" w:type="dxa"/>
-              <w:bottom w:w="0" w:type="dxa"/>
-              <w:left w:w="0" w:type="dxa"/>
-              <w:right w:w="0" w:type="dxa"/>
-            </w:tcMar>
-            <w:vAlign w:val="center"/>
-          </w:tcPr>
-          <w:p>
-            <w:pPr>
-              <w:pStyle w:val="Normal"/>
-              <w:jc w:val="center"/>
-              <w:pBdr>
-                <w:bottom w:val="none" w:sz="0" w:space="0" w:color="000000"/>
-                <w:top w:val="none" w:sz="0" w:space="0" w:color="000000"/>
-                <w:left w:val="none" w:sz="0" w:space="0" w:color="000000"/>
-                <w:right w:val="none" w:sz="0" w:space="0" w:color="000000"/>
-              </w:pBdr>
-              <w:spacing w:after="100" w:before="100" w:line="240"/>
-              <w:ind w:left="100" w:right="100" w:firstLine="0" w:firstLineChars="0"/>
-              <w:rPr>
-                <w:rFonts w:ascii="Arial" w:hAnsi="Arial" w:eastAsia="Arial" w:cs="Arial"/>
-                <w:i w:val="false"/>
-                <w:b w:val="true"/>
-                <w:u w:val="none"/>
-                <w:strike w:val="false"/>
-                <w:sz w:val="20"/>
-                <w:szCs w:val="20"/>
-                <w:color w:val="000000"/>
-              </w:rPr>
-            </w:pPr>
-            <w:r>
-              <w:rPr>
-                <w:rFonts w:ascii="Arial" w:hAnsi="Arial" w:eastAsia="Arial" w:cs="Arial"/>
-                <w:i w:val="false"/>
-                <w:b w:val="true"/>
-                <w:u w:val="none"/>
-                <w:strike w:val="false"/>
-                <w:sz w:val="20"/>
-                <w:szCs w:val="20"/>
-                <w:color w:val="000000"/>
-              </w:rPr>
-              <w:t xml:space="preserve">6</w:t>
             </w:r>
           </w:p>
         </w:tc>
       </w:tr>
       <w:tr>
         <w:trPr>
-          <w:trHeight w:val="440" w:hRule="auto"/>
+          <w:trHeight w:val="454" w:hRule="auto"/>
         </w:trPr>
+        body1
         <w:tc>
           <w:tcPr>
             <w:tcBorders>
@@ -501,7 +441,6 @@
           </w:tcPr>
           <w:p>
             <w:pPr>
-              <w:pStyle w:val="Normal"/>
               <w:jc w:val="left"/>
               <w:pBdr>
                 <w:bottom w:val="none" w:sz="0" w:space="0" w:color="000000"/>
@@ -533,7 +472,7 @@
                 <w:szCs w:val="20"/>
                 <w:color w:val="000000"/>
               </w:rPr>
-              <w:t xml:space="preserve">1. GrimAge2</w:t>
+              <w:t xml:space="preserve">1. GrimAge2 z-score</w:t>
             </w:r>
           </w:p>
         </w:tc>
@@ -556,7 +495,6 @@
           </w:tcPr>
           <w:p>
             <w:pPr>
-              <w:pStyle w:val="Normal"/>
               <w:jc w:val="center"/>
               <w:pBdr>
                 <w:bottom w:val="none" w:sz="0" w:space="0" w:color="000000"/>
@@ -611,7 +549,6 @@
           </w:tcPr>
           <w:p>
             <w:pPr>
-              <w:pStyle w:val="Normal"/>
               <w:jc w:val="center"/>
               <w:pBdr>
                 <w:bottom w:val="none" w:sz="0" w:space="0" w:color="000000"/>
@@ -666,7 +603,6 @@
           </w:tcPr>
           <w:p>
             <w:pPr>
-              <w:pStyle w:val="Normal"/>
               <w:jc w:val="center"/>
               <w:pBdr>
                 <w:bottom w:val="none" w:sz="0" w:space="0" w:color="000000"/>
@@ -721,7 +657,6 @@
           </w:tcPr>
           <w:p>
             <w:pPr>
-              <w:pStyle w:val="Normal"/>
               <w:jc w:val="center"/>
               <w:pBdr>
                 <w:bottom w:val="none" w:sz="0" w:space="0" w:color="000000"/>
@@ -776,62 +711,6 @@
           </w:tcPr>
           <w:p>
             <w:pPr>
-              <w:pStyle w:val="Normal"/>
-              <w:jc w:val="center"/>
-              <w:pBdr>
-                <w:bottom w:val="none" w:sz="0" w:space="0" w:color="000000"/>
-                <w:top w:val="none" w:sz="0" w:space="0" w:color="000000"/>
-                <w:left w:val="none" w:sz="0" w:space="0" w:color="000000"/>
-                <w:right w:val="none" w:sz="0" w:space="0" w:color="000000"/>
-              </w:pBdr>
-              <w:spacing w:after="100" w:before="100" w:line="240"/>
-              <w:ind w:left="100" w:right="100" w:firstLine="0" w:firstLineChars="0"/>
-              <w:rPr>
-                <w:rFonts w:ascii="Arial" w:hAnsi="Arial" w:eastAsia="Arial" w:cs="Arial"/>
-                <w:i w:val="false"/>
-                <w:b w:val="false"/>
-                <w:u w:val="none"/>
-                <w:strike w:val="false"/>
-                <w:sz w:val="20"/>
-                <w:szCs w:val="20"/>
-                <w:color w:val="000000"/>
-              </w:rPr>
-            </w:pPr>
-            <w:r>
-              <w:rPr>
-                <w:rFonts w:ascii="Arial" w:hAnsi="Arial" w:eastAsia="Arial" w:cs="Arial"/>
-                <w:i w:val="false"/>
-                <w:b w:val="false"/>
-                <w:u w:val="none"/>
-                <w:strike w:val="false"/>
-                <w:sz w:val="20"/>
-                <w:szCs w:val="20"/>
-                <w:color w:val="000000"/>
-              </w:rPr>
-              <w:t xml:space="preserve"/>
-            </w:r>
-          </w:p>
-        </w:tc>
-        <w:tc>
-          <w:tcPr>
-            <w:tcBorders>
-              <w:bottom w:val="none" w:sz="0" w:space="0" w:color="000000"/>
-              <w:top w:val="single" w:sz="12" w:space="0" w:color="666666"/>
-              <w:left w:val="none" w:sz="0" w:space="0" w:color="000000"/>
-              <w:right w:val="none" w:sz="0" w:space="0" w:color="000000"/>
-            </w:tcBorders>
-            <w:shd w:val="clear" w:color="auto" w:fill="FFFFFF"/>
-            <w:tcMar>
-              <w:top w:w="0" w:type="dxa"/>
-              <w:bottom w:w="0" w:type="dxa"/>
-              <w:left w:w="0" w:type="dxa"/>
-              <w:right w:w="0" w:type="dxa"/>
-            </w:tcMar>
-            <w:vAlign w:val="center"/>
-          </w:tcPr>
-          <w:p>
-            <w:pPr>
-              <w:pStyle w:val="Normal"/>
               <w:jc w:val="center"/>
               <w:pBdr>
                 <w:bottom w:val="none" w:sz="0" w:space="0" w:color="000000"/>
@@ -870,8 +749,9 @@
       </w:tr>
       <w:tr>
         <w:trPr>
-          <w:trHeight w:val="440" w:hRule="auto"/>
+          <w:trHeight w:val="415" w:hRule="auto"/>
         </w:trPr>
+        body2
         <w:tc>
           <w:tcPr>
             <w:tcBorders>
@@ -891,7 +771,6 @@
           </w:tcPr>
           <w:p>
             <w:pPr>
-              <w:pStyle w:val="Normal"/>
               <w:jc w:val="left"/>
               <w:pBdr>
                 <w:bottom w:val="none" w:sz="0" w:space="0" w:color="000000"/>
@@ -923,7 +802,7 @@
                 <w:szCs w:val="20"/>
                 <w:color w:val="000000"/>
               </w:rPr>
-              <w:t xml:space="preserve">2. DunedinPACE</w:t>
+              <w:t xml:space="preserve">2. DunedinPACE z-score</w:t>
             </w:r>
           </w:p>
         </w:tc>
@@ -946,7 +825,6 @@
           </w:tcPr>
           <w:p>
             <w:pPr>
-              <w:pStyle w:val="Normal"/>
               <w:jc w:val="center"/>
               <w:pBdr>
                 <w:bottom w:val="none" w:sz="0" w:space="0" w:color="000000"/>
@@ -1001,7 +879,6 @@
           </w:tcPr>
           <w:p>
             <w:pPr>
-              <w:pStyle w:val="Normal"/>
               <w:jc w:val="center"/>
               <w:pBdr>
                 <w:bottom w:val="none" w:sz="0" w:space="0" w:color="000000"/>
@@ -1056,7 +933,6 @@
           </w:tcPr>
           <w:p>
             <w:pPr>
-              <w:pStyle w:val="Normal"/>
               <w:jc w:val="center"/>
               <w:pBdr>
                 <w:bottom w:val="none" w:sz="0" w:space="0" w:color="000000"/>
@@ -1111,7 +987,6 @@
           </w:tcPr>
           <w:p>
             <w:pPr>
-              <w:pStyle w:val="Normal"/>
               <w:jc w:val="center"/>
               <w:pBdr>
                 <w:bottom w:val="none" w:sz="0" w:space="0" w:color="000000"/>
@@ -1166,62 +1041,6 @@
           </w:tcPr>
           <w:p>
             <w:pPr>
-              <w:pStyle w:val="Normal"/>
-              <w:jc w:val="center"/>
-              <w:pBdr>
-                <w:bottom w:val="none" w:sz="0" w:space="0" w:color="000000"/>
-                <w:top w:val="none" w:sz="0" w:space="0" w:color="000000"/>
-                <w:left w:val="none" w:sz="0" w:space="0" w:color="000000"/>
-                <w:right w:val="none" w:sz="0" w:space="0" w:color="000000"/>
-              </w:pBdr>
-              <w:spacing w:after="100" w:before="100" w:line="240"/>
-              <w:ind w:left="100" w:right="100" w:firstLine="0" w:firstLineChars="0"/>
-              <w:rPr>
-                <w:rFonts w:ascii="Arial" w:hAnsi="Arial" w:eastAsia="Arial" w:cs="Arial"/>
-                <w:i w:val="false"/>
-                <w:b w:val="false"/>
-                <w:u w:val="none"/>
-                <w:strike w:val="false"/>
-                <w:sz w:val="20"/>
-                <w:szCs w:val="20"/>
-                <w:color w:val="000000"/>
-              </w:rPr>
-            </w:pPr>
-            <w:r>
-              <w:rPr>
-                <w:rFonts w:ascii="Arial" w:hAnsi="Arial" w:eastAsia="Arial" w:cs="Arial"/>
-                <w:i w:val="false"/>
-                <w:b w:val="false"/>
-                <w:u w:val="none"/>
-                <w:strike w:val="false"/>
-                <w:sz w:val="20"/>
-                <w:szCs w:val="20"/>
-                <w:color w:val="000000"/>
-              </w:rPr>
-              <w:t xml:space="preserve"/>
-            </w:r>
-          </w:p>
-        </w:tc>
-        <w:tc>
-          <w:tcPr>
-            <w:tcBorders>
-              <w:bottom w:val="none" w:sz="0" w:space="0" w:color="000000"/>
-              <w:top w:val="none" w:sz="0" w:space="0" w:color="000000"/>
-              <w:left w:val="none" w:sz="0" w:space="0" w:color="000000"/>
-              <w:right w:val="none" w:sz="0" w:space="0" w:color="000000"/>
-            </w:tcBorders>
-            <w:shd w:val="clear" w:color="auto" w:fill="FFFFFF"/>
-            <w:tcMar>
-              <w:top w:w="0" w:type="dxa"/>
-              <w:bottom w:w="0" w:type="dxa"/>
-              <w:left w:w="0" w:type="dxa"/>
-              <w:right w:w="0" w:type="dxa"/>
-            </w:tcMar>
-            <w:vAlign w:val="center"/>
-          </w:tcPr>
-          <w:p>
-            <w:pPr>
-              <w:pStyle w:val="Normal"/>
               <w:jc w:val="center"/>
               <w:pBdr>
                 <w:bottom w:val="none" w:sz="0" w:space="0" w:color="000000"/>
@@ -1260,8 +1079,9 @@
       </w:tr>
       <w:tr>
         <w:trPr>
-          <w:trHeight w:val="440" w:hRule="auto"/>
+          <w:trHeight w:val="453" w:hRule="auto"/>
         </w:trPr>
+        body3
         <w:tc>
           <w:tcPr>
             <w:tcBorders>
@@ -1281,7 +1101,6 @@
           </w:tcPr>
           <w:p>
             <w:pPr>
-              <w:pStyle w:val="Normal"/>
               <w:jc w:val="left"/>
               <w:pBdr>
                 <w:bottom w:val="none" w:sz="0" w:space="0" w:color="000000"/>
@@ -1336,7 +1155,6 @@
           </w:tcPr>
           <w:p>
             <w:pPr>
-              <w:pStyle w:val="Normal"/>
               <w:jc w:val="center"/>
               <w:pBdr>
                 <w:bottom w:val="none" w:sz="0" w:space="0" w:color="000000"/>
@@ -1391,7 +1209,6 @@
           </w:tcPr>
           <w:p>
             <w:pPr>
-              <w:pStyle w:val="Normal"/>
               <w:jc w:val="center"/>
               <w:pBdr>
                 <w:bottom w:val="none" w:sz="0" w:space="0" w:color="000000"/>
@@ -1446,7 +1263,6 @@
           </w:tcPr>
           <w:p>
             <w:pPr>
-              <w:pStyle w:val="Normal"/>
               <w:jc w:val="center"/>
               <w:pBdr>
                 <w:bottom w:val="none" w:sz="0" w:space="0" w:color="000000"/>
@@ -1501,7 +1317,6 @@
           </w:tcPr>
           <w:p>
             <w:pPr>
-              <w:pStyle w:val="Normal"/>
               <w:jc w:val="center"/>
               <w:pBdr>
                 <w:bottom w:val="none" w:sz="0" w:space="0" w:color="000000"/>
@@ -1556,62 +1371,6 @@
           </w:tcPr>
           <w:p>
             <w:pPr>
-              <w:pStyle w:val="Normal"/>
-              <w:jc w:val="center"/>
-              <w:pBdr>
-                <w:bottom w:val="none" w:sz="0" w:space="0" w:color="000000"/>
-                <w:top w:val="none" w:sz="0" w:space="0" w:color="000000"/>
-                <w:left w:val="none" w:sz="0" w:space="0" w:color="000000"/>
-                <w:right w:val="none" w:sz="0" w:space="0" w:color="000000"/>
-              </w:pBdr>
-              <w:spacing w:after="100" w:before="100" w:line="240"/>
-              <w:ind w:left="100" w:right="100" w:firstLine="0" w:firstLineChars="0"/>
-              <w:rPr>
-                <w:rFonts w:ascii="Arial" w:hAnsi="Arial" w:eastAsia="Arial" w:cs="Arial"/>
-                <w:i w:val="false"/>
-                <w:b w:val="false"/>
-                <w:u w:val="none"/>
-                <w:strike w:val="false"/>
-                <w:sz w:val="20"/>
-                <w:szCs w:val="20"/>
-                <w:color w:val="000000"/>
-              </w:rPr>
-            </w:pPr>
-            <w:r>
-              <w:rPr>
-                <w:rFonts w:ascii="Arial" w:hAnsi="Arial" w:eastAsia="Arial" w:cs="Arial"/>
-                <w:i w:val="false"/>
-                <w:b w:val="false"/>
-                <w:u w:val="none"/>
-                <w:strike w:val="false"/>
-                <w:sz w:val="20"/>
-                <w:szCs w:val="20"/>
-                <w:color w:val="000000"/>
-              </w:rPr>
-              <w:t xml:space="preserve"/>
-            </w:r>
-          </w:p>
-        </w:tc>
-        <w:tc>
-          <w:tcPr>
-            <w:tcBorders>
-              <w:bottom w:val="none" w:sz="0" w:space="0" w:color="000000"/>
-              <w:top w:val="none" w:sz="0" w:space="0" w:color="000000"/>
-              <w:left w:val="none" w:sz="0" w:space="0" w:color="000000"/>
-              <w:right w:val="none" w:sz="0" w:space="0" w:color="000000"/>
-            </w:tcBorders>
-            <w:shd w:val="clear" w:color="auto" w:fill="FFFFFF"/>
-            <w:tcMar>
-              <w:top w:w="0" w:type="dxa"/>
-              <w:bottom w:w="0" w:type="dxa"/>
-              <w:left w:w="0" w:type="dxa"/>
-              <w:right w:w="0" w:type="dxa"/>
-            </w:tcMar>
-            <w:vAlign w:val="center"/>
-          </w:tcPr>
-          <w:p>
-            <w:pPr>
-              <w:pStyle w:val="Normal"/>
               <w:jc w:val="center"/>
               <w:pBdr>
                 <w:bottom w:val="none" w:sz="0" w:space="0" w:color="000000"/>
@@ -1650,8 +1409,9 @@
       </w:tr>
       <w:tr>
         <w:trPr>
-          <w:trHeight w:val="440" w:hRule="auto"/>
+          <w:trHeight w:val="415" w:hRule="auto"/>
         </w:trPr>
+        body4
         <w:tc>
           <w:tcPr>
             <w:tcBorders>
@@ -1671,7 +1431,6 @@
           </w:tcPr>
           <w:p>
             <w:pPr>
-              <w:pStyle w:val="Normal"/>
               <w:jc w:val="left"/>
               <w:pBdr>
                 <w:bottom w:val="none" w:sz="0" w:space="0" w:color="000000"/>
@@ -1703,7 +1462,7 @@
                 <w:szCs w:val="20"/>
                 <w:color w:val="000000"/>
               </w:rPr>
-              <w:t xml:space="preserve">4. Number of chronic conditions</w:t>
+              <w:t xml:space="preserve">4. Perceived cancer risk z-score</w:t>
             </w:r>
           </w:p>
         </w:tc>
@@ -1726,7 +1485,6 @@
           </w:tcPr>
           <w:p>
             <w:pPr>
-              <w:pStyle w:val="Normal"/>
               <w:jc w:val="center"/>
               <w:pBdr>
                 <w:bottom w:val="none" w:sz="0" w:space="0" w:color="000000"/>
@@ -1758,7 +1516,7 @@
                 <w:szCs w:val="20"/>
                 <w:color w:val="000000"/>
               </w:rPr>
-              <w:t xml:space="preserve"> 0.173***</w:t>
+              <w:t xml:space="preserve">-0.037</w:t>
             </w:r>
           </w:p>
         </w:tc>
@@ -1781,7 +1539,6 @@
           </w:tcPr>
           <w:p>
             <w:pPr>
-              <w:pStyle w:val="Normal"/>
               <w:jc w:val="center"/>
               <w:pBdr>
                 <w:bottom w:val="none" w:sz="0" w:space="0" w:color="000000"/>
@@ -1813,7 +1570,7 @@
                 <w:szCs w:val="20"/>
                 <w:color w:val="000000"/>
               </w:rPr>
-              <w:t xml:space="preserve"> 0.202***</w:t>
+              <w:t xml:space="preserve"> 0.062*</w:t>
             </w:r>
           </w:p>
         </w:tc>
@@ -1836,7 +1593,6 @@
           </w:tcPr>
           <w:p>
             <w:pPr>
-              <w:pStyle w:val="Normal"/>
               <w:jc w:val="center"/>
               <w:pBdr>
                 <w:bottom w:val="none" w:sz="0" w:space="0" w:color="000000"/>
@@ -1868,7 +1624,7 @@
                 <w:szCs w:val="20"/>
                 <w:color w:val="000000"/>
               </w:rPr>
-              <w:t xml:space="preserve"> 0.088**</w:t>
+              <w:t xml:space="preserve">-0.144***</w:t>
             </w:r>
           </w:p>
         </w:tc>
@@ -1891,7 +1647,6 @@
           </w:tcPr>
           <w:p>
             <w:pPr>
-              <w:pStyle w:val="Normal"/>
               <w:jc w:val="center"/>
               <w:pBdr>
                 <w:bottom w:val="none" w:sz="0" w:space="0" w:color="000000"/>
@@ -1946,62 +1701,6 @@
           </w:tcPr>
           <w:p>
             <w:pPr>
-              <w:pStyle w:val="Normal"/>
-              <w:jc w:val="center"/>
-              <w:pBdr>
-                <w:bottom w:val="none" w:sz="0" w:space="0" w:color="000000"/>
-                <w:top w:val="none" w:sz="0" w:space="0" w:color="000000"/>
-                <w:left w:val="none" w:sz="0" w:space="0" w:color="000000"/>
-                <w:right w:val="none" w:sz="0" w:space="0" w:color="000000"/>
-              </w:pBdr>
-              <w:spacing w:after="100" w:before="100" w:line="240"/>
-              <w:ind w:left="100" w:right="100" w:firstLine="0" w:firstLineChars="0"/>
-              <w:rPr>
-                <w:rFonts w:ascii="Arial" w:hAnsi="Arial" w:eastAsia="Arial" w:cs="Arial"/>
-                <w:i w:val="false"/>
-                <w:b w:val="false"/>
-                <w:u w:val="none"/>
-                <w:strike w:val="false"/>
-                <w:sz w:val="20"/>
-                <w:szCs w:val="20"/>
-                <w:color w:val="000000"/>
-              </w:rPr>
-            </w:pPr>
-            <w:r>
-              <w:rPr>
-                <w:rFonts w:ascii="Arial" w:hAnsi="Arial" w:eastAsia="Arial" w:cs="Arial"/>
-                <w:i w:val="false"/>
-                <w:b w:val="false"/>
-                <w:u w:val="none"/>
-                <w:strike w:val="false"/>
-                <w:sz w:val="20"/>
-                <w:szCs w:val="20"/>
-                <w:color w:val="000000"/>
-              </w:rPr>
-              <w:t xml:space="preserve"/>
-            </w:r>
-          </w:p>
-        </w:tc>
-        <w:tc>
-          <w:tcPr>
-            <w:tcBorders>
-              <w:bottom w:val="none" w:sz="0" w:space="0" w:color="000000"/>
-              <w:top w:val="none" w:sz="0" w:space="0" w:color="000000"/>
-              <w:left w:val="none" w:sz="0" w:space="0" w:color="000000"/>
-              <w:right w:val="none" w:sz="0" w:space="0" w:color="000000"/>
-            </w:tcBorders>
-            <w:shd w:val="clear" w:color="auto" w:fill="FFFFFF"/>
-            <w:tcMar>
-              <w:top w:w="0" w:type="dxa"/>
-              <w:bottom w:w="0" w:type="dxa"/>
-              <w:left w:w="0" w:type="dxa"/>
-              <w:right w:w="0" w:type="dxa"/>
-            </w:tcMar>
-            <w:vAlign w:val="center"/>
-          </w:tcPr>
-          <w:p>
-            <w:pPr>
-              <w:pStyle w:val="Normal"/>
               <w:jc w:val="center"/>
               <w:pBdr>
                 <w:bottom w:val="none" w:sz="0" w:space="0" w:color="000000"/>
@@ -2040,398 +1739,9 @@
       </w:tr>
       <w:tr>
         <w:trPr>
-          <w:trHeight w:val="440" w:hRule="auto"/>
+          <w:trHeight w:val="454" w:hRule="auto"/>
         </w:trPr>
-        <w:tc>
-          <w:tcPr>
-            <w:tcBorders>
-              <w:bottom w:val="none" w:sz="0" w:space="0" w:color="000000"/>
-              <w:top w:val="none" w:sz="0" w:space="0" w:color="000000"/>
-              <w:left w:val="none" w:sz="0" w:space="0" w:color="000000"/>
-              <w:right w:val="none" w:sz="0" w:space="0" w:color="000000"/>
-            </w:tcBorders>
-            <w:shd w:val="clear" w:color="auto" w:fill="FFFFFF"/>
-            <w:tcMar>
-              <w:top w:w="0" w:type="dxa"/>
-              <w:bottom w:w="0" w:type="dxa"/>
-              <w:left w:w="0" w:type="dxa"/>
-              <w:right w:w="0" w:type="dxa"/>
-            </w:tcMar>
-            <w:vAlign w:val="center"/>
-          </w:tcPr>
-          <w:p>
-            <w:pPr>
-              <w:pStyle w:val="Normal"/>
-              <w:jc w:val="left"/>
-              <w:pBdr>
-                <w:bottom w:val="none" w:sz="0" w:space="0" w:color="000000"/>
-                <w:top w:val="none" w:sz="0" w:space="0" w:color="000000"/>
-                <w:left w:val="none" w:sz="0" w:space="0" w:color="000000"/>
-                <w:right w:val="none" w:sz="0" w:space="0" w:color="000000"/>
-              </w:pBdr>
-              <w:spacing w:after="100" w:before="100" w:line="240"/>
-              <w:ind w:left="100" w:right="100" w:firstLine="0" w:firstLineChars="0"/>
-              <w:rPr>
-                <w:rFonts w:ascii="Arial" w:hAnsi="Arial" w:eastAsia="Arial" w:cs="Arial"/>
-                <w:i w:val="false"/>
-                <w:b w:val="false"/>
-                <w:u w:val="none"/>
-                <w:strike w:val="false"/>
-                <w:sz w:val="20"/>
-                <w:szCs w:val="20"/>
-                <w:color w:val="000000"/>
-              </w:rPr>
-            </w:pPr>
-            <w:r>
-              <w:rPr>
-                <w:rFonts w:ascii="Arial" w:hAnsi="Arial" w:eastAsia="Arial" w:cs="Arial"/>
-                <w:i w:val="false"/>
-                <w:b w:val="false"/>
-                <w:u w:val="none"/>
-                <w:strike w:val="false"/>
-                <w:sz w:val="20"/>
-                <w:szCs w:val="20"/>
-                <w:color w:val="000000"/>
-              </w:rPr>
-              <w:t xml:space="preserve">5. Perceived cancer risk z-score</w:t>
-            </w:r>
-          </w:p>
-        </w:tc>
-        <w:tc>
-          <w:tcPr>
-            <w:tcBorders>
-              <w:bottom w:val="none" w:sz="0" w:space="0" w:color="000000"/>
-              <w:top w:val="none" w:sz="0" w:space="0" w:color="000000"/>
-              <w:left w:val="none" w:sz="0" w:space="0" w:color="000000"/>
-              <w:right w:val="none" w:sz="0" w:space="0" w:color="000000"/>
-            </w:tcBorders>
-            <w:shd w:val="clear" w:color="auto" w:fill="FFFFFF"/>
-            <w:tcMar>
-              <w:top w:w="0" w:type="dxa"/>
-              <w:bottom w:w="0" w:type="dxa"/>
-              <w:left w:w="0" w:type="dxa"/>
-              <w:right w:w="0" w:type="dxa"/>
-            </w:tcMar>
-            <w:vAlign w:val="center"/>
-          </w:tcPr>
-          <w:p>
-            <w:pPr>
-              <w:pStyle w:val="Normal"/>
-              <w:jc w:val="center"/>
-              <w:pBdr>
-                <w:bottom w:val="none" w:sz="0" w:space="0" w:color="000000"/>
-                <w:top w:val="none" w:sz="0" w:space="0" w:color="000000"/>
-                <w:left w:val="none" w:sz="0" w:space="0" w:color="000000"/>
-                <w:right w:val="none" w:sz="0" w:space="0" w:color="000000"/>
-              </w:pBdr>
-              <w:spacing w:after="100" w:before="100" w:line="240"/>
-              <w:ind w:left="100" w:right="100" w:firstLine="0" w:firstLineChars="0"/>
-              <w:rPr>
-                <w:rFonts w:ascii="Arial" w:hAnsi="Arial" w:eastAsia="Arial" w:cs="Arial"/>
-                <w:i w:val="false"/>
-                <w:b w:val="false"/>
-                <w:u w:val="none"/>
-                <w:strike w:val="false"/>
-                <w:sz w:val="20"/>
-                <w:szCs w:val="20"/>
-                <w:color w:val="000000"/>
-              </w:rPr>
-            </w:pPr>
-            <w:r>
-              <w:rPr>
-                <w:rFonts w:ascii="Arial" w:hAnsi="Arial" w:eastAsia="Arial" w:cs="Arial"/>
-                <w:i w:val="false"/>
-                <w:b w:val="false"/>
-                <w:u w:val="none"/>
-                <w:strike w:val="false"/>
-                <w:sz w:val="20"/>
-                <w:szCs w:val="20"/>
-                <w:color w:val="000000"/>
-              </w:rPr>
-              <w:t xml:space="preserve">-0.037</w:t>
-            </w:r>
-          </w:p>
-        </w:tc>
-        <w:tc>
-          <w:tcPr>
-            <w:tcBorders>
-              <w:bottom w:val="none" w:sz="0" w:space="0" w:color="000000"/>
-              <w:top w:val="none" w:sz="0" w:space="0" w:color="000000"/>
-              <w:left w:val="none" w:sz="0" w:space="0" w:color="000000"/>
-              <w:right w:val="none" w:sz="0" w:space="0" w:color="000000"/>
-            </w:tcBorders>
-            <w:shd w:val="clear" w:color="auto" w:fill="FFFFFF"/>
-            <w:tcMar>
-              <w:top w:w="0" w:type="dxa"/>
-              <w:bottom w:w="0" w:type="dxa"/>
-              <w:left w:w="0" w:type="dxa"/>
-              <w:right w:w="0" w:type="dxa"/>
-            </w:tcMar>
-            <w:vAlign w:val="center"/>
-          </w:tcPr>
-          <w:p>
-            <w:pPr>
-              <w:pStyle w:val="Normal"/>
-              <w:jc w:val="center"/>
-              <w:pBdr>
-                <w:bottom w:val="none" w:sz="0" w:space="0" w:color="000000"/>
-                <w:top w:val="none" w:sz="0" w:space="0" w:color="000000"/>
-                <w:left w:val="none" w:sz="0" w:space="0" w:color="000000"/>
-                <w:right w:val="none" w:sz="0" w:space="0" w:color="000000"/>
-              </w:pBdr>
-              <w:spacing w:after="100" w:before="100" w:line="240"/>
-              <w:ind w:left="100" w:right="100" w:firstLine="0" w:firstLineChars="0"/>
-              <w:rPr>
-                <w:rFonts w:ascii="Arial" w:hAnsi="Arial" w:eastAsia="Arial" w:cs="Arial"/>
-                <w:i w:val="false"/>
-                <w:b w:val="false"/>
-                <w:u w:val="none"/>
-                <w:strike w:val="false"/>
-                <w:sz w:val="20"/>
-                <w:szCs w:val="20"/>
-                <w:color w:val="000000"/>
-              </w:rPr>
-            </w:pPr>
-            <w:r>
-              <w:rPr>
-                <w:rFonts w:ascii="Arial" w:hAnsi="Arial" w:eastAsia="Arial" w:cs="Arial"/>
-                <w:i w:val="false"/>
-                <w:b w:val="false"/>
-                <w:u w:val="none"/>
-                <w:strike w:val="false"/>
-                <w:sz w:val="20"/>
-                <w:szCs w:val="20"/>
-                <w:color w:val="000000"/>
-              </w:rPr>
-              <w:t xml:space="preserve"> 0.062*</w:t>
-            </w:r>
-          </w:p>
-        </w:tc>
-        <w:tc>
-          <w:tcPr>
-            <w:tcBorders>
-              <w:bottom w:val="none" w:sz="0" w:space="0" w:color="000000"/>
-              <w:top w:val="none" w:sz="0" w:space="0" w:color="000000"/>
-              <w:left w:val="none" w:sz="0" w:space="0" w:color="000000"/>
-              <w:right w:val="none" w:sz="0" w:space="0" w:color="000000"/>
-            </w:tcBorders>
-            <w:shd w:val="clear" w:color="auto" w:fill="FFFFFF"/>
-            <w:tcMar>
-              <w:top w:w="0" w:type="dxa"/>
-              <w:bottom w:w="0" w:type="dxa"/>
-              <w:left w:w="0" w:type="dxa"/>
-              <w:right w:w="0" w:type="dxa"/>
-            </w:tcMar>
-            <w:vAlign w:val="center"/>
-          </w:tcPr>
-          <w:p>
-            <w:pPr>
-              <w:pStyle w:val="Normal"/>
-              <w:jc w:val="center"/>
-              <w:pBdr>
-                <w:bottom w:val="none" w:sz="0" w:space="0" w:color="000000"/>
-                <w:top w:val="none" w:sz="0" w:space="0" w:color="000000"/>
-                <w:left w:val="none" w:sz="0" w:space="0" w:color="000000"/>
-                <w:right w:val="none" w:sz="0" w:space="0" w:color="000000"/>
-              </w:pBdr>
-              <w:spacing w:after="100" w:before="100" w:line="240"/>
-              <w:ind w:left="100" w:right="100" w:firstLine="0" w:firstLineChars="0"/>
-              <w:rPr>
-                <w:rFonts w:ascii="Arial" w:hAnsi="Arial" w:eastAsia="Arial" w:cs="Arial"/>
-                <w:i w:val="false"/>
-                <w:b w:val="false"/>
-                <w:u w:val="none"/>
-                <w:strike w:val="false"/>
-                <w:sz w:val="20"/>
-                <w:szCs w:val="20"/>
-                <w:color w:val="000000"/>
-              </w:rPr>
-            </w:pPr>
-            <w:r>
-              <w:rPr>
-                <w:rFonts w:ascii="Arial" w:hAnsi="Arial" w:eastAsia="Arial" w:cs="Arial"/>
-                <w:i w:val="false"/>
-                <w:b w:val="false"/>
-                <w:u w:val="none"/>
-                <w:strike w:val="false"/>
-                <w:sz w:val="20"/>
-                <w:szCs w:val="20"/>
-                <w:color w:val="000000"/>
-              </w:rPr>
-              <w:t xml:space="preserve">-0.144***</w:t>
-            </w:r>
-          </w:p>
-        </w:tc>
-        <w:tc>
-          <w:tcPr>
-            <w:tcBorders>
-              <w:bottom w:val="none" w:sz="0" w:space="0" w:color="000000"/>
-              <w:top w:val="none" w:sz="0" w:space="0" w:color="000000"/>
-              <w:left w:val="none" w:sz="0" w:space="0" w:color="000000"/>
-              <w:right w:val="none" w:sz="0" w:space="0" w:color="000000"/>
-            </w:tcBorders>
-            <w:shd w:val="clear" w:color="auto" w:fill="FFFFFF"/>
-            <w:tcMar>
-              <w:top w:w="0" w:type="dxa"/>
-              <w:bottom w:w="0" w:type="dxa"/>
-              <w:left w:w="0" w:type="dxa"/>
-              <w:right w:w="0" w:type="dxa"/>
-            </w:tcMar>
-            <w:vAlign w:val="center"/>
-          </w:tcPr>
-          <w:p>
-            <w:pPr>
-              <w:pStyle w:val="Normal"/>
-              <w:jc w:val="center"/>
-              <w:pBdr>
-                <w:bottom w:val="none" w:sz="0" w:space="0" w:color="000000"/>
-                <w:top w:val="none" w:sz="0" w:space="0" w:color="000000"/>
-                <w:left w:val="none" w:sz="0" w:space="0" w:color="000000"/>
-                <w:right w:val="none" w:sz="0" w:space="0" w:color="000000"/>
-              </w:pBdr>
-              <w:spacing w:after="100" w:before="100" w:line="240"/>
-              <w:ind w:left="100" w:right="100" w:firstLine="0" w:firstLineChars="0"/>
-              <w:rPr>
-                <w:rFonts w:ascii="Arial" w:hAnsi="Arial" w:eastAsia="Arial" w:cs="Arial"/>
-                <w:i w:val="false"/>
-                <w:b w:val="false"/>
-                <w:u w:val="none"/>
-                <w:strike w:val="false"/>
-                <w:sz w:val="20"/>
-                <w:szCs w:val="20"/>
-                <w:color w:val="000000"/>
-              </w:rPr>
-            </w:pPr>
-            <w:r>
-              <w:rPr>
-                <w:rFonts w:ascii="Arial" w:hAnsi="Arial" w:eastAsia="Arial" w:cs="Arial"/>
-                <w:i w:val="false"/>
-                <w:b w:val="false"/>
-                <w:u w:val="none"/>
-                <w:strike w:val="false"/>
-                <w:sz w:val="20"/>
-                <w:szCs w:val="20"/>
-                <w:color w:val="000000"/>
-              </w:rPr>
-              <w:t xml:space="preserve"> 0.171***</w:t>
-            </w:r>
-          </w:p>
-        </w:tc>
-        <w:tc>
-          <w:tcPr>
-            <w:tcBorders>
-              <w:bottom w:val="none" w:sz="0" w:space="0" w:color="000000"/>
-              <w:top w:val="none" w:sz="0" w:space="0" w:color="000000"/>
-              <w:left w:val="none" w:sz="0" w:space="0" w:color="000000"/>
-              <w:right w:val="none" w:sz="0" w:space="0" w:color="000000"/>
-            </w:tcBorders>
-            <w:shd w:val="clear" w:color="auto" w:fill="FFFFFF"/>
-            <w:tcMar>
-              <w:top w:w="0" w:type="dxa"/>
-              <w:bottom w:w="0" w:type="dxa"/>
-              <w:left w:w="0" w:type="dxa"/>
-              <w:right w:w="0" w:type="dxa"/>
-            </w:tcMar>
-            <w:vAlign w:val="center"/>
-          </w:tcPr>
-          <w:p>
-            <w:pPr>
-              <w:pStyle w:val="Normal"/>
-              <w:jc w:val="center"/>
-              <w:pBdr>
-                <w:bottom w:val="none" w:sz="0" w:space="0" w:color="000000"/>
-                <w:top w:val="none" w:sz="0" w:space="0" w:color="000000"/>
-                <w:left w:val="none" w:sz="0" w:space="0" w:color="000000"/>
-                <w:right w:val="none" w:sz="0" w:space="0" w:color="000000"/>
-              </w:pBdr>
-              <w:spacing w:after="100" w:before="100" w:line="240"/>
-              <w:ind w:left="100" w:right="100" w:firstLine="0" w:firstLineChars="0"/>
-              <w:rPr>
-                <w:rFonts w:ascii="Arial" w:hAnsi="Arial" w:eastAsia="Arial" w:cs="Arial"/>
-                <w:i w:val="false"/>
-                <w:b w:val="false"/>
-                <w:u w:val="none"/>
-                <w:strike w:val="false"/>
-                <w:sz w:val="20"/>
-                <w:szCs w:val="20"/>
-                <w:color w:val="000000"/>
-              </w:rPr>
-            </w:pPr>
-            <w:r>
-              <w:rPr>
-                <w:rFonts w:ascii="Arial" w:hAnsi="Arial" w:eastAsia="Arial" w:cs="Arial"/>
-                <w:i w:val="false"/>
-                <w:b w:val="false"/>
-                <w:u w:val="none"/>
-                <w:strike w:val="false"/>
-                <w:sz w:val="20"/>
-                <w:szCs w:val="20"/>
-                <w:color w:val="000000"/>
-              </w:rPr>
-              <w:t xml:space="preserve"/>
-            </w:r>
-          </w:p>
-        </w:tc>
-        <w:tc>
-          <w:tcPr>
-            <w:tcBorders>
-              <w:bottom w:val="none" w:sz="0" w:space="0" w:color="000000"/>
-              <w:top w:val="none" w:sz="0" w:space="0" w:color="000000"/>
-              <w:left w:val="none" w:sz="0" w:space="0" w:color="000000"/>
-              <w:right w:val="none" w:sz="0" w:space="0" w:color="000000"/>
-            </w:tcBorders>
-            <w:shd w:val="clear" w:color="auto" w:fill="FFFFFF"/>
-            <w:tcMar>
-              <w:top w:w="0" w:type="dxa"/>
-              <w:bottom w:w="0" w:type="dxa"/>
-              <w:left w:w="0" w:type="dxa"/>
-              <w:right w:w="0" w:type="dxa"/>
-            </w:tcMar>
-            <w:vAlign w:val="center"/>
-          </w:tcPr>
-          <w:p>
-            <w:pPr>
-              <w:pStyle w:val="Normal"/>
-              <w:jc w:val="center"/>
-              <w:pBdr>
-                <w:bottom w:val="none" w:sz="0" w:space="0" w:color="000000"/>
-                <w:top w:val="none" w:sz="0" w:space="0" w:color="000000"/>
-                <w:left w:val="none" w:sz="0" w:space="0" w:color="000000"/>
-                <w:right w:val="none" w:sz="0" w:space="0" w:color="000000"/>
-              </w:pBdr>
-              <w:spacing w:after="100" w:before="100" w:line="240"/>
-              <w:ind w:left="100" w:right="100" w:firstLine="0" w:firstLineChars="0"/>
-              <w:rPr>
-                <w:rFonts w:ascii="Arial" w:hAnsi="Arial" w:eastAsia="Arial" w:cs="Arial"/>
-                <w:i w:val="false"/>
-                <w:b w:val="false"/>
-                <w:u w:val="none"/>
-                <w:strike w:val="false"/>
-                <w:sz w:val="20"/>
-                <w:szCs w:val="20"/>
-                <w:color w:val="000000"/>
-              </w:rPr>
-            </w:pPr>
-            <w:r>
-              <w:rPr>
-                <w:rFonts w:ascii="Arial" w:hAnsi="Arial" w:eastAsia="Arial" w:cs="Arial"/>
-                <w:i w:val="false"/>
-                <w:b w:val="false"/>
-                <w:u w:val="none"/>
-                <w:strike w:val="false"/>
-                <w:sz w:val="20"/>
-                <w:szCs w:val="20"/>
-                <w:color w:val="000000"/>
-              </w:rPr>
-              <w:t xml:space="preserve"/>
-            </w:r>
-          </w:p>
-        </w:tc>
-      </w:tr>
-      <w:tr>
-        <w:trPr>
-          <w:trHeight w:val="455" w:hRule="auto"/>
-        </w:trPr>
+        body5
         <w:tc>
           <w:tcPr>
             <w:tcBorders>
@@ -2451,7 +1761,6 @@
           </w:tcPr>
           <w:p>
             <w:pPr>
-              <w:pStyle w:val="Normal"/>
               <w:jc w:val="left"/>
               <w:pBdr>
                 <w:bottom w:val="none" w:sz="0" w:space="0" w:color="000000"/>
@@ -2483,7 +1792,7 @@
                 <w:szCs w:val="20"/>
                 <w:color w:val="000000"/>
               </w:rPr>
-              <w:t xml:space="preserve">6. Self-efficacy</w:t>
+              <w:t xml:space="preserve">5. Self-efficacy for Cancer Prevention</w:t>
             </w:r>
           </w:p>
         </w:tc>
@@ -2506,7 +1815,6 @@
           </w:tcPr>
           <w:p>
             <w:pPr>
-              <w:pStyle w:val="Normal"/>
               <w:jc w:val="center"/>
               <w:pBdr>
                 <w:bottom w:val="none" w:sz="0" w:space="0" w:color="000000"/>
@@ -2561,7 +1869,6 @@
           </w:tcPr>
           <w:p>
             <w:pPr>
-              <w:pStyle w:val="Normal"/>
               <w:jc w:val="center"/>
               <w:pBdr>
                 <w:bottom w:val="none" w:sz="0" w:space="0" w:color="000000"/>
@@ -2616,7 +1923,6 @@
           </w:tcPr>
           <w:p>
             <w:pPr>
-              <w:pStyle w:val="Normal"/>
               <w:jc w:val="center"/>
               <w:pBdr>
                 <w:bottom w:val="none" w:sz="0" w:space="0" w:color="000000"/>
@@ -2671,7 +1977,6 @@
           </w:tcPr>
           <w:p>
             <w:pPr>
-              <w:pStyle w:val="Normal"/>
               <w:jc w:val="center"/>
               <w:pBdr>
                 <w:bottom w:val="none" w:sz="0" w:space="0" w:color="000000"/>
@@ -2703,7 +2008,7 @@
                 <w:szCs w:val="20"/>
                 <w:color w:val="000000"/>
               </w:rPr>
-              <w:t xml:space="preserve">-0.035</w:t>
+              <w:t xml:space="preserve">-0.120***</w:t>
             </w:r>
           </w:p>
         </w:tc>
@@ -2726,62 +2031,6 @@
           </w:tcPr>
           <w:p>
             <w:pPr>
-              <w:pStyle w:val="Normal"/>
-              <w:jc w:val="center"/>
-              <w:pBdr>
-                <w:bottom w:val="none" w:sz="0" w:space="0" w:color="000000"/>
-                <w:top w:val="none" w:sz="0" w:space="0" w:color="000000"/>
-                <w:left w:val="none" w:sz="0" w:space="0" w:color="000000"/>
-                <w:right w:val="none" w:sz="0" w:space="0" w:color="000000"/>
-              </w:pBdr>
-              <w:spacing w:after="100" w:before="100" w:line="240"/>
-              <w:ind w:left="100" w:right="100" w:firstLine="0" w:firstLineChars="0"/>
-              <w:rPr>
-                <w:rFonts w:ascii="Arial" w:hAnsi="Arial" w:eastAsia="Arial" w:cs="Arial"/>
-                <w:i w:val="false"/>
-                <w:b w:val="false"/>
-                <w:u w:val="none"/>
-                <w:strike w:val="false"/>
-                <w:sz w:val="20"/>
-                <w:szCs w:val="20"/>
-                <w:color w:val="000000"/>
-              </w:rPr>
-            </w:pPr>
-            <w:r>
-              <w:rPr>
-                <w:rFonts w:ascii="Arial" w:hAnsi="Arial" w:eastAsia="Arial" w:cs="Arial"/>
-                <w:i w:val="false"/>
-                <w:b w:val="false"/>
-                <w:u w:val="none"/>
-                <w:strike w:val="false"/>
-                <w:sz w:val="20"/>
-                <w:szCs w:val="20"/>
-                <w:color w:val="000000"/>
-              </w:rPr>
-              <w:t xml:space="preserve">-0.120***</w:t>
-            </w:r>
-          </w:p>
-        </w:tc>
-        <w:tc>
-          <w:tcPr>
-            <w:tcBorders>
-              <w:bottom w:val="single" w:sz="12" w:space="0" w:color="666666"/>
-              <w:top w:val="none" w:sz="0" w:space="0" w:color="000000"/>
-              <w:left w:val="none" w:sz="0" w:space="0" w:color="000000"/>
-              <w:right w:val="none" w:sz="0" w:space="0" w:color="000000"/>
-            </w:tcBorders>
-            <w:shd w:val="clear" w:color="auto" w:fill="FFFFFF"/>
-            <w:tcMar>
-              <w:top w:w="0" w:type="dxa"/>
-              <w:bottom w:w="0" w:type="dxa"/>
-              <w:left w:w="0" w:type="dxa"/>
-              <w:right w:w="0" w:type="dxa"/>
-            </w:tcMar>
-            <w:vAlign w:val="center"/>
-          </w:tcPr>
-          <w:p>
-            <w:pPr>
-              <w:pStyle w:val="Normal"/>
               <w:jc w:val="center"/>
               <w:pBdr>
                 <w:bottom w:val="none" w:sz="0" w:space="0" w:color="000000"/>
@@ -2822,9 +2071,10 @@
         <w:trPr>
           <w:trHeight w:val="360" w:hRule="auto"/>
         </w:trPr>
-        <w:tc>
-          <w:tcPr>
-            <w:gridSpan w:val="7"/>
+        footer1
+        <w:tc>
+          <w:tcPr>
+            <w:gridSpan w:val="6"/>
             <w:tcBorders>
               <w:bottom w:val="none" w:sz="0" w:space="0" w:color="FFFFFF"/>
               <w:top w:val="single" w:sz="12" w:space="0" w:color="666666"/>
@@ -2842,7 +2092,6 @@
           </w:tcPr>
           <w:p>
             <w:pPr>
-              <w:pStyle w:val="Normal"/>
               <w:jc w:val="left"/>
               <w:pBdr>
                 <w:bottom w:val="none" w:sz="0" w:space="0" w:color="000000"/>

</xml_diff>